<commit_message>
docs: descartar la captura de la pantalla de generación del plan
Esa pantalla solo aparece mientras se genera un plan real con la IA, y se
decidió no incluirla. Se saca el texto que la marcaba como pendiente en
el manual, y la referencia en la especificación de CU07, tanto en los
documentos sueltos como en la documentación principal.
</commit_message>
<xml_diff>
--- a/documentacion/1-proyecto/Documentacion-FitPocket.docx
+++ b/documentacion/1-proyecto/Documentacion-FitPocket.docx
@@ -11475,31 +11475,31 @@
         <w:t xml:space="preserve">pages/CargandoPlan</w:t>
       </w:r>
       <w:r>
-        <w:t xml:space="preserve">). Capturas:</w:t>
-      </w:r>
-      <w:r>
-        <w:t xml:space="preserve"> </w:t>
+        <w:t xml:space="preserve">). Captura: 8-manual-de-usuario/capturas/04-onboarding-4.png.</w:t>
+      </w:r>
+      <w:r>
+        <w:t xml:space="preserve"/>
       </w:r>
       <w:r>
         <w:rPr>
           <w:rStyle w:val="VerbatimChar"/>
         </w:rPr>
-        <w:t xml:space="preserve">8-manual-de-usuario/capturas/04-onboarding-4.png</w:t>
-      </w:r>
-      <w:r>
-        <w:t xml:space="preserve">,</w:t>
-      </w:r>
-      <w:r>
-        <w:t xml:space="preserve"> </w:t>
+        <w:t xml:space="preserve"/>
+      </w:r>
+      <w:r>
+        <w:t xml:space="preserve"/>
+      </w:r>
+      <w:r>
+        <w:t xml:space="preserve"/>
       </w:r>
       <w:r>
         <w:rPr>
           <w:rStyle w:val="VerbatimChar"/>
         </w:rPr>
-        <w:t xml:space="preserve">8-manual-de-usuario/capturas/05-generando-plan.png</w:t>
-      </w:r>
-      <w:r>
-        <w:t xml:space="preserve">.</w:t>
+        <w:t xml:space="preserve"/>
+      </w:r>
+      <w:r>
+        <w:t xml:space="preserve"/>
       </w:r>
     </w:p>
     <w:p>
@@ -30558,22 +30558,6 @@
       </w:r>
       <w:r>
         <w:t xml:space="preserve">.</w:t>
-      </w:r>
-    </w:p>
-    <w:p>
-      <w:pPr/>
-      <w:r>
-        <w:t xml:space="preserve">Generando el plan</w:t>
-      </w:r>
-      <w:r>
-        <w:t xml:space="preserve"> </w:t>
-      </w:r>
-      <w:r>
-        <w:rPr>
-          <w:i/>
-          <w:iCs/>
-        </w:rPr>
-        <w:t xml:space="preserve">(captura pendiente: esta pantalla solo aparece mientras se genera un plan real)</w:t>
       </w:r>
     </w:p>
     <w:bookmarkEnd w:id="118"/>

</xml_diff>